<commit_message>
pred==0 done, add/remove links next
</commit_message>
<xml_diff>
--- a/writing/jsmb-abstract.docx
+++ b/writing/jsmb-abstract.docx
@@ -1,35 +1,29 @@
 
 <file path=word/document.xml><?xml version="1.0" encoding="utf-8"?>
-<w:document xmlns:o="urn:schemas-microsoft-com:office:office" xmlns:r="http://schemas.openxmlformats.org/officeDocument/2006/relationships" xmlns:v="urn:schemas-microsoft-com:vml" xmlns:w="http://schemas.openxmlformats.org/wordprocessingml/2006/main" xmlns:w10="urn:schemas-microsoft-com:office:word" xmlns:wp="http://schemas.openxmlformats.org/drawingml/2006/wordprocessingDrawing" xmlns:wps="http://schemas.microsoft.com/office/word/2010/wordprocessingShape" xmlns:wpg="http://schemas.microsoft.com/office/word/2010/wordprocessingGroup" xmlns:mc="http://schemas.openxmlformats.org/markup-compatibility/2006" xmlns:wp14="http://schemas.microsoft.com/office/word/2010/wordprocessingDrawing" xmlns:w14="http://schemas.microsoft.com/office/word/2010/wordml" xmlns:w15="http://schemas.microsoft.com/office/word/2012/wordml" mc:Ignorable="w14 wp14 w15">
+<w:document xmlns:wpc="http://schemas.microsoft.com/office/word/2010/wordprocessingCanvas" xmlns:mc="http://schemas.openxmlformats.org/markup-compatibility/2006" xmlns:o="urn:schemas-microsoft-com:office:office" xmlns:r="http://schemas.openxmlformats.org/officeDocument/2006/relationships" xmlns:m="http://schemas.openxmlformats.org/officeDocument/2006/math" xmlns:v="urn:schemas-microsoft-com:vml" xmlns:wp14="http://schemas.microsoft.com/office/word/2010/wordprocessingDrawing" xmlns:wp="http://schemas.openxmlformats.org/drawingml/2006/wordprocessingDrawing" xmlns:w="http://schemas.openxmlformats.org/wordprocessingml/2006/main" xmlns:w14="http://schemas.microsoft.com/office/word/2010/wordml" xmlns:w10="urn:schemas-microsoft-com:office:word" xmlns:w15="http://schemas.microsoft.com/office/word/2012/wordml" xmlns:wpg="http://schemas.microsoft.com/office/word/2010/wordprocessingGroup" xmlns:wpi="http://schemas.microsoft.com/office/word/2010/wordprocessingInk" xmlns:wne="http://schemas.microsoft.com/office/word/2006/wordml" xmlns:wps="http://schemas.microsoft.com/office/word/2010/wordprocessingShape" xmlns:wpsCustomData="http://www.wps.cn/officeDocument/2013/wpsCustomData" mc:Ignorable="w14 w15 wp14">
   <w:body>
     <w:p>
       <w:pPr>
-        <w:pStyle w:val="Heading2"/>
+        <w:pStyle w:val="5"/>
         <w:bidi w:val="0"/>
         <w:spacing w:before="200" w:after="120"/>
-        <w:ind w:hanging="0" w:start="0"/>
+        <w:ind w:left="0" w:firstLine="0"/>
         <w:jc w:val="center"/>
-        <w:rPr/>
-      </w:pPr>
-      <w:r>
-        <w:rPr/>
+      </w:pPr>
+      <w:r>
         <w:t>Emergence of metabolic strategies in a consumption-secretion model of a cancer cell community</w:t>
       </w:r>
     </w:p>
     <w:p>
       <w:pPr>
-        <w:pStyle w:val="BodyText"/>
+        <w:pStyle w:val="4"/>
         <w:bidi w:val="0"/>
         <w:jc w:val="center"/>
-        <w:rPr/>
-      </w:pPr>
-      <w:r>
-        <w:rPr/>
-      </w:r>
+      </w:pPr>
     </w:p>
     <w:p>
       <w:pPr>
-        <w:pStyle w:val="BlockQuotation"/>
+        <w:pStyle w:val="14"/>
         <w:bidi w:val="0"/>
         <w:spacing w:before="0" w:after="169"/>
         <w:jc w:val="center"/>
@@ -86,13 +80,12 @@
     </w:p>
     <w:p>
       <w:pPr>
-        <w:pStyle w:val="BlockQuotation"/>
+        <w:pStyle w:val="14"/>
         <w:bidi w:val="0"/>
         <w:spacing w:before="0" w:after="169"/>
         <w:jc w:val="center"/>
         <w:rPr>
           <w:i/>
-          <w:i/>
           <w:iCs/>
           <w:sz w:val="21"/>
           <w:szCs w:val="21"/>
@@ -120,13 +113,12 @@
     </w:p>
     <w:p>
       <w:pPr>
-        <w:pStyle w:val="BlockQuotation"/>
+        <w:pStyle w:val="14"/>
         <w:bidi w:val="0"/>
         <w:spacing w:before="0" w:after="169"/>
         <w:jc w:val="center"/>
         <w:rPr>
           <w:i/>
-          <w:i/>
           <w:iCs/>
           <w:sz w:val="21"/>
           <w:szCs w:val="21"/>
@@ -154,11 +146,10 @@
     </w:p>
     <w:p>
       <w:pPr>
-        <w:pStyle w:val="BlockQuotation"/>
+        <w:pStyle w:val="14"/>
         <w:bidi w:val="0"/>
         <w:spacing w:before="57" w:after="57"/>
         <w:jc w:val="center"/>
-        <w:rPr/>
       </w:pPr>
       <w:r>
         <w:rPr>
@@ -169,26 +160,42 @@
         </w:rPr>
         <w:t xml:space="preserve">*Corresponding authors: </w:t>
       </w:r>
-      <w:hyperlink r:id="rId2">
-        <w:r>
-          <w:rPr>
-            <w:rStyle w:val="Hyperlink"/>
-            <w:i/>
-            <w:iCs/>
-            <w:sz w:val="21"/>
-            <w:szCs w:val="21"/>
-          </w:rPr>
-          <w:t>mkjolly@iisc.ac.in</w:t>
-        </w:r>
-      </w:hyperlink>
+      <w:r>
+        <w:fldChar w:fldCharType="begin"/>
+      </w:r>
+      <w:r>
+        <w:instrText xml:space="preserve"> HYPERLINK "mailto:mkjolly@iisc.ac.in" \h </w:instrText>
+      </w:r>
+      <w:r>
+        <w:fldChar w:fldCharType="separate"/>
+      </w:r>
+      <w:r>
+        <w:rPr>
+          <w:rStyle w:val="9"/>
+          <w:i/>
+          <w:iCs/>
+          <w:sz w:val="21"/>
+          <w:szCs w:val="21"/>
+        </w:rPr>
+        <w:t>mkjolly@iisc.ac.in</w:t>
+      </w:r>
+      <w:r>
+        <w:rPr>
+          <w:rStyle w:val="9"/>
+          <w:i/>
+          <w:iCs/>
+          <w:sz w:val="21"/>
+          <w:szCs w:val="21"/>
+        </w:rPr>
+        <w:fldChar w:fldCharType="end"/>
+      </w:r>
     </w:p>
     <w:p>
       <w:pPr>
-        <w:pStyle w:val="BlockQuotation"/>
+        <w:pStyle w:val="14"/>
         <w:bidi w:val="0"/>
         <w:spacing w:before="57" w:after="57"/>
         <w:jc w:val="center"/>
-        <w:rPr/>
       </w:pPr>
       <w:r>
         <w:rPr>
@@ -199,18 +206,35 @@
         </w:rPr>
         <w:t xml:space="preserve">                                          </w:t>
       </w:r>
-      <w:hyperlink r:id="rId3">
-        <w:r>
-          <w:rPr>
-            <w:rStyle w:val="Hyperlink"/>
-            <w:i/>
-            <w:iCs/>
-            <w:sz w:val="21"/>
-            <w:szCs w:val="21"/>
-          </w:rPr>
-          <w:t>akshitg@icts.res.in</w:t>
-        </w:r>
-      </w:hyperlink>
+      <w:r>
+        <w:fldChar w:fldCharType="begin"/>
+      </w:r>
+      <w:r>
+        <w:instrText xml:space="preserve"> HYPERLINK "mailto:akshitg@icts.res.in" \h </w:instrText>
+      </w:r>
+      <w:r>
+        <w:fldChar w:fldCharType="separate"/>
+      </w:r>
+      <w:r>
+        <w:rPr>
+          <w:rStyle w:val="9"/>
+          <w:i/>
+          <w:iCs/>
+          <w:sz w:val="21"/>
+          <w:szCs w:val="21"/>
+        </w:rPr>
+        <w:t>akshitg@icts.res.in</w:t>
+      </w:r>
+      <w:r>
+        <w:rPr>
+          <w:rStyle w:val="9"/>
+          <w:i/>
+          <w:iCs/>
+          <w:sz w:val="21"/>
+          <w:szCs w:val="21"/>
+        </w:rPr>
+        <w:fldChar w:fldCharType="end"/>
+      </w:r>
       <w:r>
         <w:rPr>
           <w:i/>
@@ -223,255 +247,531 @@
     </w:p>
     <w:p>
       <w:pPr>
-        <w:pStyle w:val="Normal"/>
         <w:bidi w:val="0"/>
-        <w:jc w:val="start"/>
-        <w:rPr/>
-      </w:pPr>
-      <w:r>
-        <w:rPr/>
-      </w:r>
+        <w:jc w:val="left"/>
+      </w:pPr>
     </w:p>
     <w:p>
       <w:pPr>
-        <w:pStyle w:val="Normal"/>
         <w:bidi w:val="0"/>
-        <w:jc w:val="start"/>
-        <w:rPr/>
-      </w:pPr>
-      <w:r>
-        <w:rPr/>
-      </w:r>
+        <w:jc w:val="left"/>
+      </w:pPr>
     </w:p>
     <w:p>
       <w:pPr>
-        <w:pStyle w:val="Normal"/>
         <w:bidi w:val="0"/>
-        <w:jc w:val="start"/>
-        <w:rPr/>
-      </w:pPr>
-      <w:r>
-        <w:rPr/>
-        <w:t>Cell metabolism and energetics provide a</w:t>
-      </w:r>
-      <w:r>
-        <w:rPr/>
-        <w:t>n effective</w:t>
-      </w:r>
-      <w:r>
-        <w:rPr/>
-        <w:t xml:space="preserve"> window into how a cell integrates different aspects of its function, both internally and with a dynamic environment. It could also connect cellular behaviour to measurable fluxes of various extracellular metabolites, whose uptake and secretion could hold clues </w:t>
-      </w:r>
-      <w:r>
-        <w:rPr/>
-        <w:t>about the</w:t>
-      </w:r>
-      <w:r>
-        <w:rPr/>
-        <w:t xml:space="preserve"> underlying dynamics of the cell population. </w:t>
-      </w:r>
-      <w:r>
-        <w:rPr/>
-        <w:t xml:space="preserve">Nevertheless, the use of such a framework to better understand and predict the behaviour of cancer populations has so far been limited. </w:t>
-      </w:r>
-      <w:r>
-        <w:rPr/>
-        <w:t xml:space="preserve">In this study </w:t>
-      </w:r>
-      <w:r>
-        <w:rPr/>
-        <w:t>therefore</w:t>
-      </w:r>
-      <w:r>
-        <w:rPr/>
-        <w:t xml:space="preserve">, we </w:t>
-      </w:r>
-      <w:r>
-        <w:rPr/>
-        <w:t>build</w:t>
-      </w:r>
-      <w:r>
-        <w:rPr/>
-        <w:t xml:space="preserve"> a </w:t>
-      </w:r>
-      <w:r>
-        <w:rPr/>
-        <w:t xml:space="preserve">metabolic modelling </w:t>
-      </w:r>
-      <w:r>
-        <w:rPr/>
-        <w:t>framework in the context of cancer, with the basic goal of using bulk metabolomic data collected at the tumour level to predict the emergence and dynamics of metabolic phenotypes in the cancer cell population. We develop a network-based model of metabolite uptake and secretion, which uses a machine learning algorithm to learn an optimal set of cell phenotypes that can best predict a given metabolomic profile. This allows us to investigate how many cell types are required to explain a given metabolomic profile, how these cell types differ in their uptake-secretion properties, and whether the overall dynamics of the total population can be understood in terms of interactions between these cell types. Our model framework can therefore provide explicitly mechanistic insights into tumour growth, and further identify key metabolites whose temporal dynamics could be of predictive value for monitoring cancer growth and progression.</w:t>
-      </w:r>
+        <w:jc w:val="left"/>
+      </w:pPr>
+      <w:r>
+        <w:t xml:space="preserve">Cell metabolism and energetics provide an effective window into how a cell integrates different aspects of its function, both internally and </w:t>
+      </w:r>
+      <w:r>
+        <w:rPr>
+          <w:rFonts w:hint="default"/>
+          <w:lang w:val="en-US"/>
+        </w:rPr>
+        <w:t xml:space="preserve">in </w:t>
+      </w:r>
+      <w:r>
+        <w:t xml:space="preserve">a dynamic environment. It could also connect cellular behaviour to measurable fluxes of various extracellular metabolites, whose uptake and secretion could hold </w:t>
+      </w:r>
+      <w:r>
+        <w:rPr>
+          <w:rFonts w:hint="default"/>
+          <w:lang w:val="en-US"/>
+        </w:rPr>
+        <w:t>thus be linked to</w:t>
+      </w:r>
+      <w:r>
+        <w:t xml:space="preserve"> the underlying </w:t>
+      </w:r>
+      <w:r>
+        <w:rPr>
+          <w:rFonts w:hint="default"/>
+          <w:lang w:val="en-US"/>
+        </w:rPr>
+        <w:t xml:space="preserve">cell </w:t>
+      </w:r>
+      <w:r>
+        <w:t>population</w:t>
+      </w:r>
+      <w:r>
+        <w:rPr>
+          <w:rFonts w:hint="default"/>
+          <w:lang w:val="en-US"/>
+        </w:rPr>
+        <w:t xml:space="preserve"> dynamics</w:t>
+      </w:r>
+      <w:r>
+        <w:t xml:space="preserve">. Nevertheless, the use of such a framework to better understand and predict the behaviour of cancer populations has so far been limited. In this study, we build a metabolic modelling framework </w:t>
+      </w:r>
+      <w:r>
+        <w:rPr>
+          <w:rFonts w:hint="default"/>
+          <w:lang w:val="en-US"/>
+        </w:rPr>
+        <w:t>for</w:t>
+      </w:r>
+      <w:r>
+        <w:t xml:space="preserve"> cancer</w:t>
+      </w:r>
+      <w:r>
+        <w:rPr>
+          <w:rFonts w:hint="default"/>
+          <w:lang w:val="en-US"/>
+        </w:rPr>
+        <w:t xml:space="preserve"> that aims to use</w:t>
+      </w:r>
+      <w:r>
+        <w:t xml:space="preserve"> bulk metabolomic data collected at the tumour level to predict the emergence and dynamics of metabolic phenotypes in the cancer cell population.</w:t>
+      </w:r>
+      <w:r>
+        <w:rPr>
+          <w:rFonts w:hint="default"/>
+          <w:lang w:val="en-US"/>
+        </w:rPr>
+        <w:t xml:space="preserve"> The framework consists of</w:t>
+      </w:r>
+      <w:r>
+        <w:t xml:space="preserve"> a network-based model of metabolite uptake and secretion, which uses a machine learning algorithm to learn an optimal set of cell phenotypes that can best predict a given metabolomic profile. This allows us to investigate </w:t>
+      </w:r>
+      <w:r>
+        <w:rPr>
+          <w:rFonts w:hint="default"/>
+          <w:lang w:val="en-US"/>
+        </w:rPr>
+        <w:t>the number of</w:t>
+      </w:r>
+      <w:r>
+        <w:t xml:space="preserve"> cell types are required to explain a given metabolomic profile, how these cell types differ in their uptake-secretion properties, and whether the overall dynamics of the total population can be understood in terms of interactions between these cell types. </w:t>
+      </w:r>
+      <w:r>
+        <w:rPr>
+          <w:rFonts w:hint="default"/>
+          <w:lang w:val="en-US"/>
+        </w:rPr>
+        <w:t>Interestingly, empirical data on resource uptake and secretion from a large panel of cancer cell lines suggest that metabolite use in cancer cell lines is consistent with a power law model with respect to the resource supply, and our framework can be used to elucidate network properties that are sufficient and/or necessary for such behaviour. This study</w:t>
+      </w:r>
+      <w:r>
+        <w:t xml:space="preserve"> can therefore provide explicitly mechanistic insights into tumour growth, and further identify key metabolites whose temporal dynamics could be of predictive value for monitoring cancer growth and progression.</w:t>
+      </w:r>
+      <w:bookmarkStart w:id="0" w:name="_GoBack"/>
+      <w:bookmarkEnd w:id="0"/>
     </w:p>
     <w:sectPr>
-      <w:type w:val="nextPage"/>
       <w:pgSz w:w="11906" w:h="16838"/>
-      <w:pgMar w:left="1134" w:right="1134" w:gutter="0" w:header="0" w:top="1134" w:footer="0" w:bottom="1134"/>
+      <w:pgMar w:top="1134" w:right="1134" w:bottom="1134" w:left="1134" w:header="0" w:footer="0" w:gutter="0"/>
       <w:pgNumType w:fmt="decimal"/>
-      <w:formProt w:val="false"/>
-      <w:textDirection w:val="lrTb"/>
-      <w:docGrid w:type="default" w:linePitch="600" w:charSpace="32768"/>
+      <w:cols w:space="720" w:num="1"/>
+      <w:formProt w:val="0"/>
+      <w:docGrid w:linePitch="600" w:charSpace="32768"/>
     </w:sectPr>
   </w:body>
 </w:document>
 </file>
 
 <file path=word/numbering.xml><?xml version="1.0" encoding="utf-8"?>
-<w:numbering xmlns:w="http://schemas.openxmlformats.org/wordprocessingml/2006/main" xmlns:o="urn:schemas-microsoft-com:office:office" xmlns:r="http://schemas.openxmlformats.org/officeDocument/2006/relationships" xmlns:v="urn:schemas-microsoft-com:vml" xmlns:mc="http://schemas.openxmlformats.org/markup-compatibility/2006" xmlns:w14="http://schemas.microsoft.com/office/word/2010/wordml" mc:Ignorable="w14">
-  <w:abstractNum w:abstractNumId="1">
-    <w:lvl w:ilvl="0">
+<w:numbering xmlns:wpc="http://schemas.microsoft.com/office/word/2010/wordprocessingCanvas" xmlns:mc="http://schemas.openxmlformats.org/markup-compatibility/2006" xmlns:o="urn:schemas-microsoft-com:office:office" xmlns:r="http://schemas.openxmlformats.org/officeDocument/2006/relationships" xmlns:m="http://schemas.openxmlformats.org/officeDocument/2006/math" xmlns:v="urn:schemas-microsoft-com:vml" xmlns:wp14="http://schemas.microsoft.com/office/word/2010/wordprocessingDrawing" xmlns:wp="http://schemas.openxmlformats.org/drawingml/2006/wordprocessingDrawing" xmlns:w10="urn:schemas-microsoft-com:office:word" xmlns:w="http://schemas.openxmlformats.org/wordprocessingml/2006/main" xmlns:w14="http://schemas.microsoft.com/office/word/2010/wordml" xmlns:wpg="http://schemas.microsoft.com/office/word/2010/wordprocessingGroup" xmlns:wpi="http://schemas.microsoft.com/office/word/2010/wordprocessingInk" xmlns:wne="http://schemas.microsoft.com/office/word/2006/wordml" xmlns:wps="http://schemas.microsoft.com/office/word/2010/wordprocessingShape" xmlns:wpsCustomData="http://www.wps.cn/officeDocument/2013/wpsCustomData" mc:Ignorable="w14 wp14">
+  <w:abstractNum w:abstractNumId="0">
+    <w:nsid w:val="BEFED9A6"/>
+    <w:multiLevelType w:val="multilevel"/>
+    <w:tmpl w:val="BEFED9A6"/>
+    <w:lvl w:ilvl="0" w:tentative="0">
       <w:start w:val="1"/>
-      <w:pStyle w:val="Heading1"/>
       <w:numFmt w:val="none"/>
+      <w:pStyle w:val="2"/>
       <w:suff w:val="nothing"/>
       <w:lvlText w:val="%1"/>
-      <w:lvlJc w:val="start"/>
+      <w:lvlJc w:val="left"/>
       <w:pPr>
         <w:tabs>
-          <w:tab w:val="num" w:pos="0"/>
+          <w:tab w:val="left" w:pos="0"/>
         </w:tabs>
-        <w:ind w:start="0" w:hanging="0"/>
+        <w:ind w:left="0" w:firstLine="0"/>
       </w:pPr>
     </w:lvl>
-    <w:lvl w:ilvl="1">
+    <w:lvl w:ilvl="1" w:tentative="0">
       <w:start w:val="1"/>
-      <w:pStyle w:val="Heading2"/>
       <w:numFmt w:val="none"/>
+      <w:pStyle w:val="5"/>
       <w:suff w:val="nothing"/>
       <w:lvlText w:val="%2"/>
-      <w:lvlJc w:val="start"/>
+      <w:lvlJc w:val="left"/>
       <w:pPr>
         <w:tabs>
-          <w:tab w:val="num" w:pos="0"/>
+          <w:tab w:val="left" w:pos="0"/>
         </w:tabs>
-        <w:ind w:start="0" w:hanging="0"/>
+        <w:ind w:left="0" w:firstLine="0"/>
       </w:pPr>
     </w:lvl>
-    <w:lvl w:ilvl="2">
+    <w:lvl w:ilvl="2" w:tentative="0">
       <w:start w:val="1"/>
       <w:numFmt w:val="none"/>
       <w:suff w:val="nothing"/>
       <w:lvlText w:val="%3"/>
-      <w:lvlJc w:val="start"/>
+      <w:lvlJc w:val="left"/>
       <w:pPr>
         <w:tabs>
-          <w:tab w:val="num" w:pos="0"/>
+          <w:tab w:val="left" w:pos="0"/>
         </w:tabs>
-        <w:ind w:start="0" w:hanging="0"/>
+        <w:ind w:left="0" w:firstLine="0"/>
       </w:pPr>
     </w:lvl>
-    <w:lvl w:ilvl="3">
+    <w:lvl w:ilvl="3" w:tentative="0">
       <w:start w:val="1"/>
       <w:numFmt w:val="none"/>
       <w:suff w:val="nothing"/>
       <w:lvlText w:val="%4"/>
-      <w:lvlJc w:val="start"/>
+      <w:lvlJc w:val="left"/>
       <w:pPr>
         <w:tabs>
-          <w:tab w:val="num" w:pos="0"/>
+          <w:tab w:val="left" w:pos="0"/>
         </w:tabs>
-        <w:ind w:start="0" w:hanging="0"/>
+        <w:ind w:left="0" w:firstLine="0"/>
       </w:pPr>
     </w:lvl>
-    <w:lvl w:ilvl="4">
+    <w:lvl w:ilvl="4" w:tentative="0">
       <w:start w:val="1"/>
       <w:numFmt w:val="none"/>
       <w:suff w:val="nothing"/>
       <w:lvlText w:val="%5"/>
-      <w:lvlJc w:val="start"/>
+      <w:lvlJc w:val="left"/>
       <w:pPr>
         <w:tabs>
-          <w:tab w:val="num" w:pos="0"/>
+          <w:tab w:val="left" w:pos="0"/>
         </w:tabs>
-        <w:ind w:start="0" w:hanging="0"/>
+        <w:ind w:left="0" w:firstLine="0"/>
       </w:pPr>
     </w:lvl>
-    <w:lvl w:ilvl="5">
+    <w:lvl w:ilvl="5" w:tentative="0">
       <w:start w:val="1"/>
       <w:numFmt w:val="none"/>
       <w:suff w:val="nothing"/>
       <w:lvlText w:val="%6"/>
-      <w:lvlJc w:val="start"/>
+      <w:lvlJc w:val="left"/>
       <w:pPr>
         <w:tabs>
-          <w:tab w:val="num" w:pos="0"/>
+          <w:tab w:val="left" w:pos="0"/>
         </w:tabs>
-        <w:ind w:start="0" w:hanging="0"/>
+        <w:ind w:left="0" w:firstLine="0"/>
       </w:pPr>
     </w:lvl>
-    <w:lvl w:ilvl="6">
+    <w:lvl w:ilvl="6" w:tentative="0">
       <w:start w:val="1"/>
       <w:numFmt w:val="none"/>
       <w:suff w:val="nothing"/>
       <w:lvlText w:val="%7"/>
-      <w:lvlJc w:val="start"/>
+      <w:lvlJc w:val="left"/>
       <w:pPr>
         <w:tabs>
-          <w:tab w:val="num" w:pos="0"/>
+          <w:tab w:val="left" w:pos="0"/>
         </w:tabs>
-        <w:ind w:start="0" w:hanging="0"/>
+        <w:ind w:left="0" w:firstLine="0"/>
       </w:pPr>
     </w:lvl>
-    <w:lvl w:ilvl="7">
+    <w:lvl w:ilvl="7" w:tentative="0">
       <w:start w:val="1"/>
       <w:numFmt w:val="none"/>
       <w:suff w:val="nothing"/>
       <w:lvlText w:val="%8"/>
-      <w:lvlJc w:val="start"/>
+      <w:lvlJc w:val="left"/>
       <w:pPr>
         <w:tabs>
-          <w:tab w:val="num" w:pos="0"/>
+          <w:tab w:val="left" w:pos="0"/>
         </w:tabs>
-        <w:ind w:start="0" w:hanging="0"/>
+        <w:ind w:left="0" w:firstLine="0"/>
       </w:pPr>
     </w:lvl>
-    <w:lvl w:ilvl="8">
+    <w:lvl w:ilvl="8" w:tentative="0">
       <w:start w:val="1"/>
       <w:numFmt w:val="none"/>
       <w:suff w:val="nothing"/>
       <w:lvlText w:val="%9"/>
-      <w:lvlJc w:val="start"/>
+      <w:lvlJc w:val="left"/>
       <w:pPr>
         <w:tabs>
-          <w:tab w:val="num" w:pos="0"/>
+          <w:tab w:val="left" w:pos="0"/>
         </w:tabs>
-        <w:ind w:start="0" w:hanging="0"/>
+        <w:ind w:left="0" w:firstLine="0"/>
       </w:pPr>
     </w:lvl>
   </w:abstractNum>
   <w:num w:numId="1">
-    <w:abstractNumId w:val="1"/>
+    <w:abstractNumId w:val="0"/>
   </w:num>
 </w:numbering>
 </file>
 
 <file path=word/styles.xml><?xml version="1.0" encoding="utf-8"?>
-<w:styles xmlns:w="http://schemas.openxmlformats.org/wordprocessingml/2006/main" xmlns:w14="http://schemas.microsoft.com/office/word/2010/wordml" xmlns:mc="http://schemas.openxmlformats.org/markup-compatibility/2006" mc:Ignorable="w14">
+<w:styles xmlns:mc="http://schemas.openxmlformats.org/markup-compatibility/2006" xmlns:o="urn:schemas-microsoft-com:office:office" xmlns:r="http://schemas.openxmlformats.org/officeDocument/2006/relationships" xmlns:m="http://schemas.openxmlformats.org/officeDocument/2006/math" xmlns:v="urn:schemas-microsoft-com:vml" xmlns:w="http://schemas.openxmlformats.org/wordprocessingml/2006/main" xmlns:w14="http://schemas.microsoft.com/office/word/2010/wordml" xmlns:w10="urn:schemas-microsoft-com:office:word" xmlns:sl="http://schemas.openxmlformats.org/schemaLibrary/2006/main" xmlns:wpsCustomData="http://www.wps.cn/officeDocument/2013/wpsCustomData" mc:Ignorable="w14">
   <w:docDefaults>
     <w:rPrDefault>
       <w:rPr>
         <w:rFonts w:ascii="Liberation Serif" w:hAnsi="Liberation Serif" w:eastAsia="Noto Serif CJK SC" w:cs="Noto Sans Devanagari"/>
-        <w:kern w:val="2"/>
-        <w:sz w:val="24"/>
-        <w:szCs w:val="24"/>
-        <w:lang w:val="en-US" w:eastAsia="zh-CN" w:bidi="hi-IN"/>
       </w:rPr>
     </w:rPrDefault>
-    <w:pPrDefault>
-      <w:pPr>
-        <w:widowControl/>
-        <w:suppressAutoHyphens w:val="true"/>
-      </w:pPr>
-    </w:pPrDefault>
+    <w:pPrDefault/>
   </w:docDefaults>
-  <w:style w:type="paragraph" w:styleId="Normal">
+  <w:latentStyles w:count="260" w:defQFormat="0" w:defUnhideWhenUsed="1" w:defSemiHidden="1" w:defUIPriority="99" w:defLockedState="0">
+    <w:lsdException w:qFormat="1" w:unhideWhenUsed="0" w:uiPriority="0" w:semiHidden="0" w:name="Normal"/>
+    <w:lsdException w:qFormat="1" w:unhideWhenUsed="0" w:uiPriority="0" w:semiHidden="0" w:name="heading 1"/>
+    <w:lsdException w:qFormat="1" w:unhideWhenUsed="0" w:uiPriority="0" w:semiHidden="0" w:name="heading 2"/>
+    <w:lsdException w:qFormat="1" w:uiPriority="0" w:name="heading 3"/>
+    <w:lsdException w:qFormat="1" w:uiPriority="0" w:name="heading 4"/>
+    <w:lsdException w:qFormat="1" w:uiPriority="0" w:name="heading 5"/>
+    <w:lsdException w:qFormat="1" w:uiPriority="0" w:name="heading 6"/>
+    <w:lsdException w:qFormat="1" w:uiPriority="0" w:name="heading 7"/>
+    <w:lsdException w:qFormat="1" w:uiPriority="0" w:name="heading 8"/>
+    <w:lsdException w:qFormat="1" w:uiPriority="0" w:name="heading 9"/>
+    <w:lsdException w:unhideWhenUsed="0" w:uiPriority="0" w:semiHidden="0" w:name="index 1"/>
+    <w:lsdException w:unhideWhenUsed="0" w:uiPriority="0" w:semiHidden="0" w:name="index 2"/>
+    <w:lsdException w:unhideWhenUsed="0" w:uiPriority="0" w:semiHidden="0" w:name="index 3"/>
+    <w:lsdException w:unhideWhenUsed="0" w:uiPriority="0" w:semiHidden="0" w:name="index 4"/>
+    <w:lsdException w:unhideWhenUsed="0" w:uiPriority="0" w:semiHidden="0" w:name="index 5"/>
+    <w:lsdException w:unhideWhenUsed="0" w:uiPriority="0" w:semiHidden="0" w:name="index 6"/>
+    <w:lsdException w:unhideWhenUsed="0" w:uiPriority="0" w:semiHidden="0" w:name="index 7"/>
+    <w:lsdException w:unhideWhenUsed="0" w:uiPriority="0" w:semiHidden="0" w:name="index 8"/>
+    <w:lsdException w:unhideWhenUsed="0" w:uiPriority="0" w:semiHidden="0" w:name="index 9"/>
+    <w:lsdException w:unhideWhenUsed="0" w:uiPriority="0" w:semiHidden="0" w:name="toc 1"/>
+    <w:lsdException w:unhideWhenUsed="0" w:uiPriority="0" w:semiHidden="0" w:name="toc 2"/>
+    <w:lsdException w:unhideWhenUsed="0" w:uiPriority="0" w:semiHidden="0" w:name="toc 3"/>
+    <w:lsdException w:unhideWhenUsed="0" w:uiPriority="0" w:semiHidden="0" w:name="toc 4"/>
+    <w:lsdException w:unhideWhenUsed="0" w:uiPriority="0" w:semiHidden="0" w:name="toc 5"/>
+    <w:lsdException w:unhideWhenUsed="0" w:uiPriority="0" w:semiHidden="0" w:name="toc 6"/>
+    <w:lsdException w:unhideWhenUsed="0" w:uiPriority="0" w:semiHidden="0" w:name="toc 7"/>
+    <w:lsdException w:unhideWhenUsed="0" w:uiPriority="0" w:semiHidden="0" w:name="toc 8"/>
+    <w:lsdException w:unhideWhenUsed="0" w:uiPriority="0" w:semiHidden="0" w:name="toc 9"/>
+    <w:lsdException w:unhideWhenUsed="0" w:uiPriority="0" w:semiHidden="0" w:name="Normal Indent"/>
+    <w:lsdException w:unhideWhenUsed="0" w:uiPriority="0" w:semiHidden="0" w:name="footnote text"/>
+    <w:lsdException w:unhideWhenUsed="0" w:uiPriority="0" w:semiHidden="0" w:name="annotation text"/>
+    <w:lsdException w:unhideWhenUsed="0" w:uiPriority="0" w:semiHidden="0" w:name="header"/>
+    <w:lsdException w:unhideWhenUsed="0" w:uiPriority="0" w:semiHidden="0" w:name="footer"/>
+    <w:lsdException w:unhideWhenUsed="0" w:uiPriority="0" w:semiHidden="0" w:name="index heading"/>
+    <w:lsdException w:qFormat="1" w:unhideWhenUsed="0" w:uiPriority="0" w:semiHidden="0" w:name="caption"/>
+    <w:lsdException w:unhideWhenUsed="0" w:uiPriority="0" w:semiHidden="0" w:name="table of figures"/>
+    <w:lsdException w:unhideWhenUsed="0" w:uiPriority="0" w:semiHidden="0" w:name="envelope address"/>
+    <w:lsdException w:unhideWhenUsed="0" w:uiPriority="0" w:semiHidden="0" w:name="envelope return"/>
+    <w:lsdException w:unhideWhenUsed="0" w:uiPriority="0" w:semiHidden="0" w:name="footnote reference"/>
+    <w:lsdException w:unhideWhenUsed="0" w:uiPriority="0" w:semiHidden="0" w:name="annotation reference"/>
+    <w:lsdException w:unhideWhenUsed="0" w:uiPriority="0" w:semiHidden="0" w:name="line number"/>
+    <w:lsdException w:unhideWhenUsed="0" w:uiPriority="0" w:semiHidden="0" w:name="page number"/>
+    <w:lsdException w:unhideWhenUsed="0" w:uiPriority="0" w:semiHidden="0" w:name="endnote reference"/>
+    <w:lsdException w:unhideWhenUsed="0" w:uiPriority="0" w:semiHidden="0" w:name="endnote text"/>
+    <w:lsdException w:unhideWhenUsed="0" w:uiPriority="0" w:semiHidden="0" w:name="table of authorities"/>
+    <w:lsdException w:unhideWhenUsed="0" w:uiPriority="0" w:semiHidden="0" w:name="macro"/>
+    <w:lsdException w:unhideWhenUsed="0" w:uiPriority="0" w:semiHidden="0" w:name="toa heading"/>
+    <w:lsdException w:unhideWhenUsed="0" w:uiPriority="0" w:semiHidden="0" w:name="List"/>
+    <w:lsdException w:unhideWhenUsed="0" w:uiPriority="0" w:semiHidden="0" w:name="List Bullet"/>
+    <w:lsdException w:unhideWhenUsed="0" w:uiPriority="0" w:semiHidden="0" w:name="List Number"/>
+    <w:lsdException w:unhideWhenUsed="0" w:uiPriority="0" w:semiHidden="0" w:name="List 2"/>
+    <w:lsdException w:unhideWhenUsed="0" w:uiPriority="0" w:semiHidden="0" w:name="List 3"/>
+    <w:lsdException w:unhideWhenUsed="0" w:uiPriority="0" w:semiHidden="0" w:name="List 4"/>
+    <w:lsdException w:unhideWhenUsed="0" w:uiPriority="0" w:semiHidden="0" w:name="List 5"/>
+    <w:lsdException w:unhideWhenUsed="0" w:uiPriority="0" w:semiHidden="0" w:name="List Bullet 2"/>
+    <w:lsdException w:unhideWhenUsed="0" w:uiPriority="0" w:semiHidden="0" w:name="List Bullet 3"/>
+    <w:lsdException w:unhideWhenUsed="0" w:uiPriority="0" w:semiHidden="0" w:name="List Bullet 4"/>
+    <w:lsdException w:unhideWhenUsed="0" w:uiPriority="0" w:semiHidden="0" w:name="List Bullet 5"/>
+    <w:lsdException w:unhideWhenUsed="0" w:uiPriority="0" w:semiHidden="0" w:name="List Number 2"/>
+    <w:lsdException w:unhideWhenUsed="0" w:uiPriority="0" w:semiHidden="0" w:name="List Number 3"/>
+    <w:lsdException w:unhideWhenUsed="0" w:uiPriority="0" w:semiHidden="0" w:name="List Number 4"/>
+    <w:lsdException w:unhideWhenUsed="0" w:uiPriority="0" w:semiHidden="0" w:name="List Number 5"/>
+    <w:lsdException w:qFormat="1" w:unhideWhenUsed="0" w:uiPriority="0" w:semiHidden="0" w:name="Title"/>
+    <w:lsdException w:unhideWhenUsed="0" w:uiPriority="0" w:semiHidden="0" w:name="Closing"/>
+    <w:lsdException w:unhideWhenUsed="0" w:uiPriority="0" w:semiHidden="0" w:name="Signature"/>
+    <w:lsdException w:unhideWhenUsed="0" w:uiPriority="0" w:name="Default Paragraph Font"/>
+    <w:lsdException w:unhideWhenUsed="0" w:uiPriority="0" w:semiHidden="0" w:name="Body Text"/>
+    <w:lsdException w:unhideWhenUsed="0" w:uiPriority="0" w:semiHidden="0" w:name="Body Text Indent"/>
+    <w:lsdException w:unhideWhenUsed="0" w:uiPriority="0" w:semiHidden="0" w:name="List Continue"/>
+    <w:lsdException w:unhideWhenUsed="0" w:uiPriority="0" w:semiHidden="0" w:name="List Continue 2"/>
+    <w:lsdException w:unhideWhenUsed="0" w:uiPriority="0" w:semiHidden="0" w:name="List Continue 3"/>
+    <w:lsdException w:unhideWhenUsed="0" w:uiPriority="0" w:semiHidden="0" w:name="List Continue 4"/>
+    <w:lsdException w:unhideWhenUsed="0" w:uiPriority="0" w:semiHidden="0" w:name="List Continue 5"/>
+    <w:lsdException w:unhideWhenUsed="0" w:uiPriority="0" w:semiHidden="0" w:name="Message Header"/>
+    <w:lsdException w:qFormat="1" w:unhideWhenUsed="0" w:uiPriority="0" w:semiHidden="0" w:name="Subtitle"/>
+    <w:lsdException w:unhideWhenUsed="0" w:uiPriority="0" w:semiHidden="0" w:name="Salutation"/>
+    <w:lsdException w:unhideWhenUsed="0" w:uiPriority="0" w:semiHidden="0" w:name="Date"/>
+    <w:lsdException w:unhideWhenUsed="0" w:uiPriority="0" w:semiHidden="0" w:name="Body Text First Indent"/>
+    <w:lsdException w:unhideWhenUsed="0" w:uiPriority="0" w:semiHidden="0" w:name="Body Text First Indent 2"/>
+    <w:lsdException w:unhideWhenUsed="0" w:uiPriority="0" w:semiHidden="0" w:name="Note Heading"/>
+    <w:lsdException w:unhideWhenUsed="0" w:uiPriority="0" w:semiHidden="0" w:name="Body Text 2"/>
+    <w:lsdException w:unhideWhenUsed="0" w:uiPriority="0" w:semiHidden="0" w:name="Body Text 3"/>
+    <w:lsdException w:unhideWhenUsed="0" w:uiPriority="0" w:semiHidden="0" w:name="Body Text Indent 2"/>
+    <w:lsdException w:unhideWhenUsed="0" w:uiPriority="0" w:semiHidden="0" w:name="Body Text Indent 3"/>
+    <w:lsdException w:unhideWhenUsed="0" w:uiPriority="0" w:semiHidden="0" w:name="Block Text"/>
+    <w:lsdException w:unhideWhenUsed="0" w:uiPriority="0" w:semiHidden="0" w:name="Hyperlink"/>
+    <w:lsdException w:unhideWhenUsed="0" w:uiPriority="0" w:semiHidden="0" w:name="FollowedHyperlink"/>
+    <w:lsdException w:qFormat="1" w:unhideWhenUsed="0" w:uiPriority="0" w:semiHidden="0" w:name="Strong"/>
+    <w:lsdException w:qFormat="1" w:unhideWhenUsed="0" w:uiPriority="0" w:semiHidden="0" w:name="Emphasis"/>
+    <w:lsdException w:unhideWhenUsed="0" w:uiPriority="0" w:semiHidden="0" w:name="Document Map"/>
+    <w:lsdException w:unhideWhenUsed="0" w:uiPriority="0" w:semiHidden="0" w:name="Plain Text"/>
+    <w:lsdException w:unhideWhenUsed="0" w:uiPriority="0" w:semiHidden="0" w:name="E-mail Signature"/>
+    <w:lsdException w:unhideWhenUsed="0" w:uiPriority="0" w:semiHidden="0" w:name="Normal (Web)"/>
+    <w:lsdException w:unhideWhenUsed="0" w:uiPriority="0" w:semiHidden="0" w:name="HTML Acronym"/>
+    <w:lsdException w:unhideWhenUsed="0" w:uiPriority="0" w:semiHidden="0" w:name="HTML Address"/>
+    <w:lsdException w:unhideWhenUsed="0" w:uiPriority="0" w:semiHidden="0" w:name="HTML Cite"/>
+    <w:lsdException w:unhideWhenUsed="0" w:uiPriority="0" w:semiHidden="0" w:name="HTML Code"/>
+    <w:lsdException w:unhideWhenUsed="0" w:uiPriority="0" w:semiHidden="0" w:name="HTML Definition"/>
+    <w:lsdException w:unhideWhenUsed="0" w:uiPriority="0" w:semiHidden="0" w:name="HTML Keyboard"/>
+    <w:lsdException w:unhideWhenUsed="0" w:uiPriority="0" w:semiHidden="0" w:name="HTML Preformatted"/>
+    <w:lsdException w:unhideWhenUsed="0" w:uiPriority="0" w:semiHidden="0" w:name="HTML Sample"/>
+    <w:lsdException w:unhideWhenUsed="0" w:uiPriority="0" w:semiHidden="0" w:name="HTML Typewriter"/>
+    <w:lsdException w:unhideWhenUsed="0" w:uiPriority="0" w:semiHidden="0" w:name="HTML Variable"/>
+    <w:lsdException w:unhideWhenUsed="0" w:uiPriority="0" w:name="Normal Table"/>
+    <w:lsdException w:unhideWhenUsed="0" w:uiPriority="0" w:semiHidden="0" w:name="annotation subject"/>
+    <w:lsdException w:unhideWhenUsed="0" w:uiPriority="0" w:semiHidden="0" w:name="Table Simple 1"/>
+    <w:lsdException w:unhideWhenUsed="0" w:uiPriority="0" w:semiHidden="0" w:name="Table Simple 2"/>
+    <w:lsdException w:unhideWhenUsed="0" w:uiPriority="0" w:semiHidden="0" w:name="Table Simple 3"/>
+    <w:lsdException w:unhideWhenUsed="0" w:uiPriority="0" w:semiHidden="0" w:name="Table Classic 1"/>
+    <w:lsdException w:unhideWhenUsed="0" w:uiPriority="0" w:semiHidden="0" w:name="Table Classic 2"/>
+    <w:lsdException w:unhideWhenUsed="0" w:uiPriority="0" w:semiHidden="0" w:name="Table Classic 3"/>
+    <w:lsdException w:unhideWhenUsed="0" w:uiPriority="0" w:semiHidden="0" w:name="Table Classic 4"/>
+    <w:lsdException w:unhideWhenUsed="0" w:uiPriority="0" w:semiHidden="0" w:name="Table Colorful 1"/>
+    <w:lsdException w:unhideWhenUsed="0" w:uiPriority="0" w:semiHidden="0" w:name="Table Colorful 2"/>
+    <w:lsdException w:unhideWhenUsed="0" w:uiPriority="0" w:semiHidden="0" w:name="Table Colorful 3"/>
+    <w:lsdException w:unhideWhenUsed="0" w:uiPriority="0" w:semiHidden="0" w:name="Table Columns 1"/>
+    <w:lsdException w:unhideWhenUsed="0" w:uiPriority="0" w:semiHidden="0" w:name="Table Columns 2"/>
+    <w:lsdException w:unhideWhenUsed="0" w:uiPriority="0" w:semiHidden="0" w:name="Table Columns 3"/>
+    <w:lsdException w:unhideWhenUsed="0" w:uiPriority="0" w:semiHidden="0" w:name="Table Columns 4"/>
+    <w:lsdException w:unhideWhenUsed="0" w:uiPriority="0" w:semiHidden="0" w:name="Table Columns 5"/>
+    <w:lsdException w:unhideWhenUsed="0" w:uiPriority="0" w:semiHidden="0" w:name="Table Grid 1"/>
+    <w:lsdException w:unhideWhenUsed="0" w:uiPriority="0" w:semiHidden="0" w:name="Table Grid 2"/>
+    <w:lsdException w:unhideWhenUsed="0" w:uiPriority="0" w:semiHidden="0" w:name="Table Grid 3"/>
+    <w:lsdException w:unhideWhenUsed="0" w:uiPriority="0" w:semiHidden="0" w:name="Table Grid 4"/>
+    <w:lsdException w:unhideWhenUsed="0" w:uiPriority="0" w:semiHidden="0" w:name="Table Grid 5"/>
+    <w:lsdException w:unhideWhenUsed="0" w:uiPriority="0" w:semiHidden="0" w:name="Table Grid 6"/>
+    <w:lsdException w:unhideWhenUsed="0" w:uiPriority="0" w:semiHidden="0" w:name="Table Grid 7"/>
+    <w:lsdException w:unhideWhenUsed="0" w:uiPriority="0" w:semiHidden="0" w:name="Table Grid 8"/>
+    <w:lsdException w:unhideWhenUsed="0" w:uiPriority="0" w:semiHidden="0" w:name="Table List 1"/>
+    <w:lsdException w:unhideWhenUsed="0" w:uiPriority="0" w:semiHidden="0" w:name="Table List 2"/>
+    <w:lsdException w:unhideWhenUsed="0" w:uiPriority="0" w:semiHidden="0" w:name="Table List 3"/>
+    <w:lsdException w:unhideWhenUsed="0" w:uiPriority="0" w:semiHidden="0" w:name="Table List 4"/>
+    <w:lsdException w:unhideWhenUsed="0" w:uiPriority="0" w:semiHidden="0" w:name="Table List 5"/>
+    <w:lsdException w:unhideWhenUsed="0" w:uiPriority="0" w:semiHidden="0" w:name="Table List 6"/>
+    <w:lsdException w:unhideWhenUsed="0" w:uiPriority="0" w:semiHidden="0" w:name="Table List 7"/>
+    <w:lsdException w:unhideWhenUsed="0" w:uiPriority="0" w:semiHidden="0" w:name="Table List 8"/>
+    <w:lsdException w:unhideWhenUsed="0" w:uiPriority="0" w:semiHidden="0" w:name="Table 3D effects 1"/>
+    <w:lsdException w:unhideWhenUsed="0" w:uiPriority="0" w:semiHidden="0" w:name="Table 3D effects 2"/>
+    <w:lsdException w:unhideWhenUsed="0" w:uiPriority="0" w:semiHidden="0" w:name="Table 3D effects 3"/>
+    <w:lsdException w:unhideWhenUsed="0" w:uiPriority="0" w:semiHidden="0" w:name="Table Contemporary"/>
+    <w:lsdException w:unhideWhenUsed="0" w:uiPriority="0" w:semiHidden="0" w:name="Table Elegant"/>
+    <w:lsdException w:unhideWhenUsed="0" w:uiPriority="0" w:semiHidden="0" w:name="Table Professional"/>
+    <w:lsdException w:unhideWhenUsed="0" w:uiPriority="0" w:semiHidden="0" w:name="Table Subtle 1"/>
+    <w:lsdException w:unhideWhenUsed="0" w:uiPriority="0" w:semiHidden="0" w:name="Table Subtle 2"/>
+    <w:lsdException w:unhideWhenUsed="0" w:uiPriority="0" w:semiHidden="0" w:name="Table Web 1"/>
+    <w:lsdException w:unhideWhenUsed="0" w:uiPriority="0" w:semiHidden="0" w:name="Table Web 2"/>
+    <w:lsdException w:unhideWhenUsed="0" w:uiPriority="0" w:semiHidden="0" w:name="Table Web 3"/>
+    <w:lsdException w:unhideWhenUsed="0" w:uiPriority="0" w:semiHidden="0" w:name="Balloon Text"/>
+    <w:lsdException w:unhideWhenUsed="0" w:uiPriority="0" w:semiHidden="0" w:name="Table Grid"/>
+    <w:lsdException w:unhideWhenUsed="0" w:uiPriority="0" w:semiHidden="0" w:name="Table Theme"/>
+    <w:lsdException w:unhideWhenUsed="0" w:uiPriority="60" w:semiHidden="0" w:name="Light Shading"/>
+    <w:lsdException w:unhideWhenUsed="0" w:uiPriority="61" w:semiHidden="0" w:name="Light List"/>
+    <w:lsdException w:unhideWhenUsed="0" w:uiPriority="62" w:semiHidden="0" w:name="Light Grid"/>
+    <w:lsdException w:unhideWhenUsed="0" w:uiPriority="63" w:semiHidden="0" w:name="Medium Shading 1"/>
+    <w:lsdException w:unhideWhenUsed="0" w:uiPriority="64" w:semiHidden="0" w:name="Medium Shading 2"/>
+    <w:lsdException w:unhideWhenUsed="0" w:uiPriority="65" w:semiHidden="0" w:name="Medium List 1"/>
+    <w:lsdException w:unhideWhenUsed="0" w:uiPriority="66" w:semiHidden="0" w:name="Medium List 2"/>
+    <w:lsdException w:unhideWhenUsed="0" w:uiPriority="67" w:semiHidden="0" w:name="Medium Grid 1"/>
+    <w:lsdException w:unhideWhenUsed="0" w:uiPriority="68" w:semiHidden="0" w:name="Medium Grid 2"/>
+    <w:lsdException w:unhideWhenUsed="0" w:uiPriority="69" w:semiHidden="0" w:name="Medium Grid 3"/>
+    <w:lsdException w:unhideWhenUsed="0" w:uiPriority="70" w:semiHidden="0" w:name="Dark List"/>
+    <w:lsdException w:unhideWhenUsed="0" w:uiPriority="71" w:semiHidden="0" w:name="Colorful Shading"/>
+    <w:lsdException w:unhideWhenUsed="0" w:uiPriority="72" w:semiHidden="0" w:name="Colorful List"/>
+    <w:lsdException w:unhideWhenUsed="0" w:uiPriority="73" w:semiHidden="0" w:name="Colorful Grid"/>
+    <w:lsdException w:unhideWhenUsed="0" w:uiPriority="60" w:semiHidden="0" w:name="Light Shading Accent 1"/>
+    <w:lsdException w:unhideWhenUsed="0" w:uiPriority="61" w:semiHidden="0" w:name="Light List Accent 1"/>
+    <w:lsdException w:unhideWhenUsed="0" w:uiPriority="62" w:semiHidden="0" w:name="Light Grid Accent 1"/>
+    <w:lsdException w:unhideWhenUsed="0" w:uiPriority="63" w:semiHidden="0" w:name="Medium Shading 1 Accent 1"/>
+    <w:lsdException w:unhideWhenUsed="0" w:uiPriority="64" w:semiHidden="0" w:name="Medium Shading 2 Accent 1"/>
+    <w:lsdException w:unhideWhenUsed="0" w:uiPriority="65" w:semiHidden="0" w:name="Medium List 1 Accent 1"/>
+    <w:lsdException w:unhideWhenUsed="0" w:uiPriority="66" w:semiHidden="0" w:name="Medium List 2 Accent 1"/>
+    <w:lsdException w:unhideWhenUsed="0" w:uiPriority="67" w:semiHidden="0" w:name="Medium Grid 1 Accent 1"/>
+    <w:lsdException w:unhideWhenUsed="0" w:uiPriority="68" w:semiHidden="0" w:name="Medium Grid 2 Accent 1"/>
+    <w:lsdException w:unhideWhenUsed="0" w:uiPriority="69" w:semiHidden="0" w:name="Medium Grid 3 Accent 1"/>
+    <w:lsdException w:unhideWhenUsed="0" w:uiPriority="70" w:semiHidden="0" w:name="Dark List Accent 1"/>
+    <w:lsdException w:unhideWhenUsed="0" w:uiPriority="71" w:semiHidden="0" w:name="Colorful Shading Accent 1"/>
+    <w:lsdException w:unhideWhenUsed="0" w:uiPriority="72" w:semiHidden="0" w:name="Colorful List Accent 1"/>
+    <w:lsdException w:unhideWhenUsed="0" w:uiPriority="73" w:semiHidden="0" w:name="Colorful Grid Accent 1"/>
+    <w:lsdException w:unhideWhenUsed="0" w:uiPriority="60" w:semiHidden="0" w:name="Light Shading Accent 2"/>
+    <w:lsdException w:unhideWhenUsed="0" w:uiPriority="61" w:semiHidden="0" w:name="Light List Accent 2"/>
+    <w:lsdException w:unhideWhenUsed="0" w:uiPriority="62" w:semiHidden="0" w:name="Light Grid Accent 2"/>
+    <w:lsdException w:unhideWhenUsed="0" w:uiPriority="63" w:semiHidden="0" w:name="Medium Shading 1 Accent 2"/>
+    <w:lsdException w:unhideWhenUsed="0" w:uiPriority="64" w:semiHidden="0" w:name="Medium Shading 2 Accent 2"/>
+    <w:lsdException w:unhideWhenUsed="0" w:uiPriority="65" w:semiHidden="0" w:name="Medium List 1 Accent 2"/>
+    <w:lsdException w:unhideWhenUsed="0" w:uiPriority="66" w:semiHidden="0" w:name="Medium List 2 Accent 2"/>
+    <w:lsdException w:unhideWhenUsed="0" w:uiPriority="67" w:semiHidden="0" w:name="Medium Grid 1 Accent 2"/>
+    <w:lsdException w:unhideWhenUsed="0" w:uiPriority="68" w:semiHidden="0" w:name="Medium Grid 2 Accent 2"/>
+    <w:lsdException w:unhideWhenUsed="0" w:uiPriority="69" w:semiHidden="0" w:name="Medium Grid 3 Accent 2"/>
+    <w:lsdException w:unhideWhenUsed="0" w:uiPriority="70" w:semiHidden="0" w:name="Dark List Accent 2"/>
+    <w:lsdException w:unhideWhenUsed="0" w:uiPriority="71" w:semiHidden="0" w:name="Colorful Shading Accent 2"/>
+    <w:lsdException w:unhideWhenUsed="0" w:uiPriority="72" w:semiHidden="0" w:name="Colorful List Accent 2"/>
+    <w:lsdException w:unhideWhenUsed="0" w:uiPriority="73" w:semiHidden="0" w:name="Colorful Grid Accent 2"/>
+    <w:lsdException w:unhideWhenUsed="0" w:uiPriority="60" w:semiHidden="0" w:name="Light Shading Accent 3"/>
+    <w:lsdException w:unhideWhenUsed="0" w:uiPriority="61" w:semiHidden="0" w:name="Light List Accent 3"/>
+    <w:lsdException w:unhideWhenUsed="0" w:uiPriority="62" w:semiHidden="0" w:name="Light Grid Accent 3"/>
+    <w:lsdException w:unhideWhenUsed="0" w:uiPriority="63" w:semiHidden="0" w:name="Medium Shading 1 Accent 3"/>
+    <w:lsdException w:unhideWhenUsed="0" w:uiPriority="64" w:semiHidden="0" w:name="Medium Shading 2 Accent 3"/>
+    <w:lsdException w:unhideWhenUsed="0" w:uiPriority="65" w:semiHidden="0" w:name="Medium List 1 Accent 3"/>
+    <w:lsdException w:unhideWhenUsed="0" w:uiPriority="66" w:semiHidden="0" w:name="Medium List 2 Accent 3"/>
+    <w:lsdException w:unhideWhenUsed="0" w:uiPriority="67" w:semiHidden="0" w:name="Medium Grid 1 Accent 3"/>
+    <w:lsdException w:unhideWhenUsed="0" w:uiPriority="68" w:semiHidden="0" w:name="Medium Grid 2 Accent 3"/>
+    <w:lsdException w:unhideWhenUsed="0" w:uiPriority="69" w:semiHidden="0" w:name="Medium Grid 3 Accent 3"/>
+    <w:lsdException w:unhideWhenUsed="0" w:uiPriority="70" w:semiHidden="0" w:name="Dark List Accent 3"/>
+    <w:lsdException w:unhideWhenUsed="0" w:uiPriority="71" w:semiHidden="0" w:name="Colorful Shading Accent 3"/>
+    <w:lsdException w:unhideWhenUsed="0" w:uiPriority="72" w:semiHidden="0" w:name="Colorful List Accent 3"/>
+    <w:lsdException w:unhideWhenUsed="0" w:uiPriority="73" w:semiHidden="0" w:name="Colorful Grid Accent 3"/>
+    <w:lsdException w:unhideWhenUsed="0" w:uiPriority="60" w:semiHidden="0" w:name="Light Shading Accent 4"/>
+    <w:lsdException w:unhideWhenUsed="0" w:uiPriority="61" w:semiHidden="0" w:name="Light List Accent 4"/>
+    <w:lsdException w:unhideWhenUsed="0" w:uiPriority="62" w:semiHidden="0" w:name="Light Grid Accent 4"/>
+    <w:lsdException w:unhideWhenUsed="0" w:uiPriority="63" w:semiHidden="0" w:name="Medium Shading 1 Accent 4"/>
+    <w:lsdException w:unhideWhenUsed="0" w:uiPriority="64" w:semiHidden="0" w:name="Medium Shading 2 Accent 4"/>
+    <w:lsdException w:unhideWhenUsed="0" w:uiPriority="65" w:semiHidden="0" w:name="Medium List 1 Accent 4"/>
+    <w:lsdException w:unhideWhenUsed="0" w:uiPriority="66" w:semiHidden="0" w:name="Medium List 2 Accent 4"/>
+    <w:lsdException w:unhideWhenUsed="0" w:uiPriority="67" w:semiHidden="0" w:name="Medium Grid 1 Accent 4"/>
+    <w:lsdException w:unhideWhenUsed="0" w:uiPriority="68" w:semiHidden="0" w:name="Medium Grid 2 Accent 4"/>
+    <w:lsdException w:unhideWhenUsed="0" w:uiPriority="69" w:semiHidden="0" w:name="Medium Grid 3 Accent 4"/>
+    <w:lsdException w:unhideWhenUsed="0" w:uiPriority="70" w:semiHidden="0" w:name="Dark List Accent 4"/>
+    <w:lsdException w:unhideWhenUsed="0" w:uiPriority="71" w:semiHidden="0" w:name="Colorful Shading Accent 4"/>
+    <w:lsdException w:unhideWhenUsed="0" w:uiPriority="72" w:semiHidden="0" w:name="Colorful List Accent 4"/>
+    <w:lsdException w:unhideWhenUsed="0" w:uiPriority="73" w:semiHidden="0" w:name="Colorful Grid Accent 4"/>
+    <w:lsdException w:unhideWhenUsed="0" w:uiPriority="60" w:semiHidden="0" w:name="Light Shading Accent 5"/>
+    <w:lsdException w:unhideWhenUsed="0" w:uiPriority="61" w:semiHidden="0" w:name="Light List Accent 5"/>
+    <w:lsdException w:unhideWhenUsed="0" w:uiPriority="62" w:semiHidden="0" w:name="Light Grid Accent 5"/>
+    <w:lsdException w:unhideWhenUsed="0" w:uiPriority="63" w:semiHidden="0" w:name="Medium Shading 1 Accent 5"/>
+    <w:lsdException w:unhideWhenUsed="0" w:uiPriority="64" w:semiHidden="0" w:name="Medium Shading 2 Accent 5"/>
+    <w:lsdException w:unhideWhenUsed="0" w:uiPriority="65" w:semiHidden="0" w:name="Medium List 1 Accent 5"/>
+    <w:lsdException w:unhideWhenUsed="0" w:uiPriority="66" w:semiHidden="0" w:name="Medium List 2 Accent 5"/>
+    <w:lsdException w:unhideWhenUsed="0" w:uiPriority="67" w:semiHidden="0" w:name="Medium Grid 1 Accent 5"/>
+    <w:lsdException w:unhideWhenUsed="0" w:uiPriority="68" w:semiHidden="0" w:name="Medium Grid 2 Accent 5"/>
+    <w:lsdException w:unhideWhenUsed="0" w:uiPriority="69" w:semiHidden="0" w:name="Medium Grid 3 Accent 5"/>
+    <w:lsdException w:unhideWhenUsed="0" w:uiPriority="70" w:semiHidden="0" w:name="Dark List Accent 5"/>
+    <w:lsdException w:unhideWhenUsed="0" w:uiPriority="71" w:semiHidden="0" w:name="Colorful Shading Accent 5"/>
+    <w:lsdException w:unhideWhenUsed="0" w:uiPriority="72" w:semiHidden="0" w:name="Colorful List Accent 5"/>
+    <w:lsdException w:unhideWhenUsed="0" w:uiPriority="73" w:semiHidden="0" w:name="Colorful Grid Accent 5"/>
+    <w:lsdException w:unhideWhenUsed="0" w:uiPriority="60" w:semiHidden="0" w:name="Light Shading Accent 6"/>
+    <w:lsdException w:unhideWhenUsed="0" w:uiPriority="61" w:semiHidden="0" w:name="Light List Accent 6"/>
+    <w:lsdException w:unhideWhenUsed="0" w:uiPriority="62" w:semiHidden="0" w:name="Light Grid Accent 6"/>
+    <w:lsdException w:unhideWhenUsed="0" w:uiPriority="63" w:semiHidden="0" w:name="Medium Shading 1 Accent 6"/>
+    <w:lsdException w:unhideWhenUsed="0" w:uiPriority="64" w:semiHidden="0" w:name="Medium Shading 2 Accent 6"/>
+    <w:lsdException w:unhideWhenUsed="0" w:uiPriority="65" w:semiHidden="0" w:name="Medium List 1 Accent 6"/>
+    <w:lsdException w:unhideWhenUsed="0" w:uiPriority="66" w:semiHidden="0" w:name="Medium List 2 Accent 6"/>
+    <w:lsdException w:unhideWhenUsed="0" w:uiPriority="67" w:semiHidden="0" w:name="Medium Grid 1 Accent 6"/>
+    <w:lsdException w:unhideWhenUsed="0" w:uiPriority="68" w:semiHidden="0" w:name="Medium Grid 2 Accent 6"/>
+    <w:lsdException w:unhideWhenUsed="0" w:uiPriority="69" w:semiHidden="0" w:name="Medium Grid 3 Accent 6"/>
+    <w:lsdException w:unhideWhenUsed="0" w:uiPriority="70" w:semiHidden="0" w:name="Dark List Accent 6"/>
+    <w:lsdException w:unhideWhenUsed="0" w:uiPriority="71" w:semiHidden="0" w:name="Colorful Shading Accent 6"/>
+    <w:lsdException w:unhideWhenUsed="0" w:uiPriority="72" w:semiHidden="0" w:name="Colorful List Accent 6"/>
+    <w:lsdException w:unhideWhenUsed="0" w:uiPriority="73" w:semiHidden="0" w:name="Colorful Grid Accent 6"/>
+  </w:latentStyles>
+  <w:style w:type="paragraph" w:default="1" w:styleId="1">
     <w:name w:val="Normal"/>
     <w:qFormat/>
+    <w:uiPriority w:val="0"/>
     <w:pPr>
       <w:widowControl/>
-      <w:kinsoku w:val="true"/>
-      <w:overflowPunct w:val="true"/>
-      <w:autoSpaceDE w:val="true"/>
+      <w:suppressAutoHyphens/>
+      <w:kinsoku/>
+      <w:overflowPunct/>
+      <w:autoSpaceDE/>
       <w:bidi w:val="0"/>
     </w:pPr>
     <w:rPr>
@@ -483,11 +783,12 @@
       <w:lang w:val="en-US" w:eastAsia="zh-CN" w:bidi="hi-IN"/>
     </w:rPr>
   </w:style>
-  <w:style w:type="paragraph" w:styleId="Heading1">
-    <w:name w:val="Heading 1"/>
-    <w:basedOn w:val="Heading"/>
-    <w:next w:val="BodyText"/>
+  <w:style w:type="paragraph" w:styleId="2">
+    <w:name w:val="heading 1"/>
+    <w:basedOn w:val="3"/>
+    <w:next w:val="4"/>
     <w:qFormat/>
+    <w:uiPriority w:val="0"/>
     <w:pPr>
       <w:numPr>
         <w:ilvl w:val="0"/>
@@ -503,11 +804,12 @@
       <w:szCs w:val="36"/>
     </w:rPr>
   </w:style>
-  <w:style w:type="paragraph" w:styleId="Heading2">
-    <w:name w:val="Heading 2"/>
-    <w:basedOn w:val="Heading"/>
-    <w:next w:val="BodyText"/>
+  <w:style w:type="paragraph" w:styleId="5">
+    <w:name w:val="heading 2"/>
+    <w:basedOn w:val="3"/>
+    <w:next w:val="4"/>
     <w:qFormat/>
+    <w:uiPriority w:val="0"/>
     <w:pPr>
       <w:numPr>
         <w:ilvl w:val="1"/>
@@ -523,20 +825,32 @@
       <w:szCs w:val="32"/>
     </w:rPr>
   </w:style>
-  <w:style w:type="character" w:styleId="Hyperlink">
-    <w:name w:val="Hyperlink"/>
-    <w:rPr>
-      <w:color w:val="000080"/>
-      <w:u w:val="single"/>
-    </w:rPr>
-  </w:style>
-  <w:style w:type="paragraph" w:styleId="Heading">
+  <w:style w:type="character" w:default="1" w:styleId="6">
+    <w:name w:val="Default Paragraph Font"/>
+    <w:semiHidden/>
+    <w:uiPriority w:val="0"/>
+  </w:style>
+  <w:style w:type="table" w:default="1" w:styleId="7">
+    <w:name w:val="Normal Table"/>
+    <w:semiHidden/>
+    <w:uiPriority w:val="0"/>
+    <w:tblPr>
+      <w:tblCellMar>
+        <w:top w:w="0" w:type="dxa"/>
+        <w:left w:w="108" w:type="dxa"/>
+        <w:bottom w:w="0" w:type="dxa"/>
+        <w:right w:w="108" w:type="dxa"/>
+      </w:tblCellMar>
+    </w:tblPr>
+  </w:style>
+  <w:style w:type="paragraph" w:customStyle="1" w:styleId="3">
     <w:name w:val="Heading"/>
-    <w:basedOn w:val="Normal"/>
-    <w:next w:val="BodyText"/>
+    <w:basedOn w:val="1"/>
+    <w:next w:val="4"/>
     <w:qFormat/>
+    <w:uiPriority w:val="0"/>
     <w:pPr>
-      <w:keepNext w:val="true"/>
+      <w:keepNext/>
       <w:spacing w:before="240" w:after="120"/>
     </w:pPr>
     <w:rPr>
@@ -545,26 +859,19 @@
       <w:szCs w:val="28"/>
     </w:rPr>
   </w:style>
-  <w:style w:type="paragraph" w:styleId="BodyText">
+  <w:style w:type="paragraph" w:styleId="4">
     <w:name w:val="Body Text"/>
-    <w:basedOn w:val="Normal"/>
+    <w:basedOn w:val="1"/>
+    <w:uiPriority w:val="0"/>
     <w:pPr>
-      <w:spacing w:lineRule="auto" w:line="276" w:before="0" w:after="140"/>
+      <w:spacing w:before="0" w:after="140" w:line="276" w:lineRule="auto"/>
     </w:pPr>
-    <w:rPr/>
-  </w:style>
-  <w:style w:type="paragraph" w:styleId="List">
-    <w:name w:val="List"/>
-    <w:basedOn w:val="BodyText"/>
-    <w:pPr/>
-    <w:rPr>
-      <w:rFonts w:cs="Noto Sans Devanagari"/>
-    </w:rPr>
-  </w:style>
-  <w:style w:type="paragraph" w:styleId="Caption">
-    <w:name w:val="Caption"/>
-    <w:basedOn w:val="Normal"/>
+  </w:style>
+  <w:style w:type="paragraph" w:styleId="8">
+    <w:name w:val="caption"/>
+    <w:basedOn w:val="1"/>
     <w:qFormat/>
+    <w:uiPriority w:val="0"/>
     <w:pPr>
       <w:suppressLineNumbers/>
       <w:spacing w:before="120" w:after="120"/>
@@ -577,22 +884,28 @@
       <w:szCs w:val="24"/>
     </w:rPr>
   </w:style>
-  <w:style w:type="paragraph" w:styleId="Index">
-    <w:name w:val="Index"/>
-    <w:basedOn w:val="Normal"/>
-    <w:qFormat/>
-    <w:pPr>
-      <w:suppressLineNumbers/>
-    </w:pPr>
+  <w:style w:type="character" w:styleId="9">
+    <w:name w:val="Hyperlink"/>
+    <w:uiPriority w:val="0"/>
+    <w:rPr>
+      <w:color w:val="000080"/>
+      <w:u w:val="single"/>
+    </w:rPr>
+  </w:style>
+  <w:style w:type="paragraph" w:styleId="10">
+    <w:name w:val="List"/>
+    <w:basedOn w:val="4"/>
+    <w:uiPriority w:val="0"/>
     <w:rPr>
       <w:rFonts w:cs="Noto Sans Devanagari"/>
     </w:rPr>
   </w:style>
-  <w:style w:type="paragraph" w:styleId="Subtitle">
+  <w:style w:type="paragraph" w:styleId="11">
     <w:name w:val="Subtitle"/>
-    <w:basedOn w:val="Heading"/>
-    <w:next w:val="BodyText"/>
+    <w:basedOn w:val="3"/>
+    <w:next w:val="4"/>
     <w:qFormat/>
+    <w:uiPriority w:val="0"/>
     <w:pPr>
       <w:spacing w:before="60" w:after="120"/>
       <w:jc w:val="center"/>
@@ -602,11 +915,12 @@
       <w:szCs w:val="36"/>
     </w:rPr>
   </w:style>
-  <w:style w:type="paragraph" w:styleId="Title">
+  <w:style w:type="paragraph" w:styleId="12">
     <w:name w:val="Title"/>
-    <w:basedOn w:val="Heading"/>
-    <w:next w:val="BodyText"/>
+    <w:basedOn w:val="3"/>
+    <w:next w:val="4"/>
     <w:qFormat/>
+    <w:uiPriority w:val="0"/>
     <w:pPr>
       <w:jc w:val="center"/>
     </w:pPr>
@@ -617,73 +931,85 @@
       <w:szCs w:val="56"/>
     </w:rPr>
   </w:style>
-  <w:style w:type="paragraph" w:styleId="BlockQuotation">
+  <w:style w:type="paragraph" w:customStyle="1" w:styleId="13">
+    <w:name w:val="Index"/>
+    <w:basedOn w:val="1"/>
+    <w:qFormat/>
+    <w:uiPriority w:val="0"/>
+    <w:pPr>
+      <w:suppressLineNumbers/>
+    </w:pPr>
+    <w:rPr>
+      <w:rFonts w:cs="Noto Sans Devanagari"/>
+    </w:rPr>
+  </w:style>
+  <w:style w:type="paragraph" w:customStyle="1" w:styleId="14">
     <w:name w:val="Block Quotation"/>
-    <w:basedOn w:val="Normal"/>
+    <w:basedOn w:val="1"/>
     <w:qFormat/>
+    <w:uiPriority w:val="0"/>
     <w:pPr>
       <w:spacing w:before="0" w:after="283"/>
-      <w:ind w:hanging="0" w:start="567" w:end="567"/>
+      <w:ind w:left="567" w:right="567" w:firstLine="0"/>
     </w:pPr>
-    <w:rPr/>
   </w:style>
 </w:styles>
 </file>
 
 <file path=word/theme/theme1.xml><?xml version="1.0" encoding="utf-8"?>
-<a:theme xmlns:a="http://schemas.openxmlformats.org/drawingml/2006/main" xmlns:r="http://schemas.openxmlformats.org/officeDocument/2006/relationships" name="Office">
+<a:theme xmlns:a="http://schemas.openxmlformats.org/drawingml/2006/main" name="Office">
   <a:themeElements>
     <a:clrScheme name="LibreOffice">
       <a:dk1>
         <a:srgbClr val="000000"/>
       </a:dk1>
       <a:lt1>
-        <a:srgbClr val="ffffff"/>
+        <a:srgbClr val="FFFFFF"/>
       </a:lt1>
       <a:dk2>
         <a:srgbClr val="000000"/>
       </a:dk2>
       <a:lt2>
-        <a:srgbClr val="ffffff"/>
+        <a:srgbClr val="FFFFFF"/>
       </a:lt2>
       <a:accent1>
-        <a:srgbClr val="18a303"/>
+        <a:srgbClr val="18A303"/>
       </a:accent1>
       <a:accent2>
-        <a:srgbClr val="0369a3"/>
+        <a:srgbClr val="0369A3"/>
       </a:accent2>
       <a:accent3>
-        <a:srgbClr val="a33e03"/>
+        <a:srgbClr val="A33E03"/>
       </a:accent3>
       <a:accent4>
-        <a:srgbClr val="8e03a3"/>
+        <a:srgbClr val="8E03A3"/>
       </a:accent4>
       <a:accent5>
-        <a:srgbClr val="c99c00"/>
+        <a:srgbClr val="C99C00"/>
       </a:accent5>
       <a:accent6>
-        <a:srgbClr val="c9211e"/>
+        <a:srgbClr val="C9211E"/>
       </a:accent6>
       <a:hlink>
-        <a:srgbClr val="0000ee"/>
+        <a:srgbClr val="0000EE"/>
       </a:hlink>
       <a:folHlink>
-        <a:srgbClr val="551a8b"/>
+        <a:srgbClr val="551A8B"/>
       </a:folHlink>
     </a:clrScheme>
     <a:fontScheme name="Office">
       <a:majorFont>
-        <a:latin typeface="Arial" pitchFamily="0" charset="1"/>
-        <a:ea typeface="DejaVu Sans" pitchFamily="0" charset="1"/>
-        <a:cs typeface="DejaVu Sans" pitchFamily="0" charset="1"/>
+        <a:latin typeface="Arial"/>
+        <a:ea typeface="DejaVu Sans"/>
+        <a:cs typeface="DejaVu Sans"/>
       </a:majorFont>
       <a:minorFont>
-        <a:latin typeface="Arial" pitchFamily="0" charset="1"/>
-        <a:ea typeface="DejaVu Sans" pitchFamily="0" charset="1"/>
-        <a:cs typeface="DejaVu Sans" pitchFamily="0" charset="1"/>
+        <a:latin typeface="Arial"/>
+        <a:ea typeface="DejaVu Sans"/>
+        <a:cs typeface="DejaVu Sans"/>
       </a:minorFont>
     </a:fontScheme>
-    <a:fmtScheme>
+    <a:fmtScheme name="">
       <a:fillStyleLst>
         <a:solidFill>
           <a:schemeClr val="phClr"/>
@@ -733,5 +1059,6 @@
       </a:bgFillStyleLst>
     </a:fmtScheme>
   </a:themeElements>
+  <a:objectDefaults/>
 </a:theme>
 </file>
</xml_diff>